<commit_message>
Complete final manuscript citation coverage
</commit_message>
<xml_diff>
--- a/submission/nexus/NEXUS_FINAL_MANUSCRIPT.docx
+++ b/submission/nexus/NEXUS_FINAL_MANUSCRIPT.docx
@@ -352,7 +352,7 @@
         <w:rPr>
           <w:rFonts w:ascii="Times New Roman" w:hAnsi="Times New Roman"/>
         </w:rPr>
-        <w:t>Client-edge-cloud HFL was formalized by Liu et al. [1], and resource-aware client selection for IoT FL predates the present study [2]. Dynamic client-edge association and resource allocation have also been optimized jointly [3]. These results make hierarchy and multicriteria resource scoring established ingredients rather than sufficient novelty claims.</w:t>
+        <w:t>Client-edge-cloud HFL was formalized by Liu et al. [1], and resource-aware client selection for IoT FL predates the present study [2]. Dynamic client-edge association and resource allocation have also been optimized jointly [3]. Long-term participation under volatile clients has been studied explicitly [4], while recent fairness-oriented analysis further distinguishes participation equality from distributional and performance fairness [13]. These results make hierarchy, multicriteria resource scoring, and participation-aware selection established ingredients rather than sufficient novelty claims.</w:t>
       </w:r>
     </w:p>
     <w:p>
@@ -360,7 +360,7 @@
         <w:rPr>
           <w:rFonts w:ascii="Times New Roman" w:hAnsi="Times New Roman"/>
         </w:rPr>
-        <w:t>Synchronization and heterogeneity have likewise been studied extensively. HiFlash couples adaptive staleness control with heterogeneity-aware client-edge association [5]. ShapeFL reduces communication by shaping edge-level data distributions [7], while cost-efficient HFL formulations jointly optimize selection and wireless resource allocation [8]. Recent graph-based HFL also combines client clustering with communication-resource allocation under non-IID data [17], and learning-topology co-optimization has been studied for device-to-device HFL [18]. Energy-efficient HFL has additionally been developed for marine IoT settings [20].</w:t>
+        <w:t>Synchronization and heterogeneity have likewise been studied extensively. HiFlash couples adaptive staleness control with heterogeneity-aware client-edge association [5]. ShapeFL reduces communication by shaping edge-level data distributions [7], while cost-efficient HFL formulations jointly optimize selection and wireless resource allocation [8]. Recent graph-based HFL also combines client clustering with communication-resource allocation under non-IID data [17], learning-topology co-optimization has been studied for device-to-device HFL [18], and multi-job HFL jointly addresses client selection and resource allocation for consumer-grade UAVs [19]. Energy-efficient HFL has additionally been developed for marine IoT settings [20].</w:t>
       </w:r>
     </w:p>
     <w:p>

</xml_diff>

<commit_message>
Update author metadata and declarations
</commit_message>
<xml_diff>
--- a/submission/nexus/NEXUS_FINAL_MANUSCRIPT.docx
+++ b/submission/nexus/NEXUS_FINAL_MANUSCRIPT.docx
@@ -23,13 +23,7 @@
           <w:rFonts w:ascii="Times New Roman" w:hAnsi="Times New Roman"/>
           <w:b/>
         </w:rPr>
-        <w:t>Abhishek Kumar Pandey</w:t>
-      </w:r>
-      <w:r>
-        <w:rPr>
-          <w:rFonts w:ascii="Times New Roman" w:hAnsi="Times New Roman"/>
-        </w:rPr>
-        <w:t>*</w:t>
+        <w:t>Abhinandan Tripathi¹, Vijay Kumar Tiwari², Mohd. Arif³, Abhishek Kumar Pandey⁴*, Shivam Bhardwaj⁵</w:t>
       </w:r>
     </w:p>
     <w:p>
@@ -40,7 +34,7 @@
         <w:rPr>
           <w:rFonts w:ascii="Times New Roman" w:hAnsi="Times New Roman"/>
         </w:rPr>
-        <w:t>Assistant Professor, School of Computer Science Engineering and Technology, Bennett University</w:t>
+        <w:t>¹Department of Computer Science and Engineering, Buddha Institute of Technology, Gorakhpur, India</w:t>
       </w:r>
     </w:p>
     <w:p>
@@ -51,19 +45,7 @@
         <w:rPr>
           <w:rFonts w:ascii="Times New Roman" w:hAnsi="Times New Roman"/>
         </w:rPr>
-        <w:t>ORCID: 0000-0003-3799-9754</w:t>
-      </w:r>
-    </w:p>
-    <w:p>
-      <w:pPr>
-        <w:jc w:val="center"/>
-      </w:pPr>
-      <w:r>
-        <w:rPr>
-          <w:rFonts w:ascii="Times New Roman" w:hAnsi="Times New Roman"/>
-          <w:b/>
-        </w:rPr>
-        <w:t>Shivam Bhardwaj</w:t>
+        <w:t>²Department of Information Technology, Madan Mohan Malaviya University of Technology (MMMUT), Gorakhpur, India</w:t>
       </w:r>
     </w:p>
     <w:p>
@@ -74,7 +56,7 @@
         <w:rPr>
           <w:rFonts w:ascii="Times New Roman" w:hAnsi="Times New Roman"/>
         </w:rPr>
-        <w:t>Assistant Professor, United Institute of Management, Prayagraj, India</w:t>
+        <w:t>³Department of Computer Science and Engineering, Galgotias University, Greater Noida, India</w:t>
       </w:r>
     </w:p>
     <w:p>
@@ -85,7 +67,7 @@
         <w:rPr>
           <w:rFonts w:ascii="Times New Roman" w:hAnsi="Times New Roman"/>
         </w:rPr>
-        <w:t>ORCID: 0009-0005-4554-7397</w:t>
+        <w:t>⁴Department of Computer Science and Engineering, Bennett University, Greater Noida, India</w:t>
       </w:r>
     </w:p>
     <w:p>
@@ -96,7 +78,7 @@
         <w:rPr>
           <w:rFonts w:ascii="Times New Roman" w:hAnsi="Times New Roman"/>
         </w:rPr>
-        <w:t>*Corresponding author: abhishek.pandey2@bennett.edu.in</w:t>
+        <w:t>⁵United Institute of Management, Prayagraj, India</w:t>
       </w:r>
     </w:p>
     <w:p>
@@ -107,7 +89,40 @@
         <w:rPr>
           <w:rFonts w:ascii="Times New Roman" w:hAnsi="Times New Roman"/>
         </w:rPr>
-        <w:t>Shivam Bhardwaj: shivambhardwaj@gmail.com</w:t>
+        <w:t>Emails: ¹abhinandan282@bit.ac.in; ²vktitca@mmmut.ac.in; ³md.arif@galgotiasuniversity.edu.in; ⁴abhishek.pandey2@bennett.edu.in; ⁵shibambhardwaj@gmail.com</w:t>
+      </w:r>
+    </w:p>
+    <w:p>
+      <w:pPr>
+        <w:jc w:val="center"/>
+      </w:pPr>
+      <w:r>
+        <w:rPr>
+          <w:rFonts w:ascii="Times New Roman" w:hAnsi="Times New Roman"/>
+        </w:rPr>
+        <w:t>ORCID: Abhishek Kumar Pandey — 0000-0003-3799-9754; Shivam Bhardwaj — 0009-0005-4554-7397</w:t>
+      </w:r>
+    </w:p>
+    <w:p>
+      <w:pPr>
+        <w:jc w:val="center"/>
+      </w:pPr>
+      <w:r>
+        <w:rPr>
+          <w:rFonts w:ascii="Times New Roman" w:hAnsi="Times New Roman"/>
+        </w:rPr>
+        <w:t>*Corresponding author: Abhishek Kumar Pandey (abhishek.pandey2@bennett.edu.in)</w:t>
+      </w:r>
+    </w:p>
+    <w:p>
+      <w:pPr>
+        <w:jc w:val="center"/>
+      </w:pPr>
+      <w:r>
+        <w:rPr>
+          <w:rFonts w:ascii="Times New Roman" w:hAnsi="Times New Roman"/>
+        </w:rPr>
+        <w:t>All authors contributed equally to this work.</w:t>
       </w:r>
     </w:p>
     <w:p>
@@ -175,7 +190,7 @@
         <w:rPr>
           <w:rFonts w:ascii="Times New Roman" w:hAnsi="Times New Roman"/>
         </w:rPr>
-        <w:t>Pandey and Bhardwaj study how hierarchical federated-learning decisions change when model updates traverse multi-hop sensor routes. Their controller coordinates utility-target participation, update fidelity, relay pressure, and staleness, and is evaluated with held-out seeds, compression-matched controls, real sensing data, and low-power wireless replay.</w:t>
+        <w:t>Tripathi et al. study how hierarchical federated-learning decisions change when model updates traverse multi-hop sensor routes. Their controller coordinates utility-target participation, update fidelity, relay pressure, and staleness, and is evaluated with held-out seeds, compression-matched controls, real sensing data, and low-power wireless replay.</w:t>
       </w:r>
     </w:p>
     <w:p>
@@ -9526,6 +9541,70 @@
         <w:pStyle w:val="Heading1"/>
       </w:pPr>
       <w:r>
+        <w:t>Author contributions</w:t>
+      </w:r>
+    </w:p>
+    <w:p>
+      <w:r>
+        <w:rPr>
+          <w:rFonts w:ascii="Times New Roman" w:hAnsi="Times New Roman"/>
+        </w:rPr>
+        <w:t>All authors contributed equally to the conceptualization, methodology, investigation, validation, formal analysis, interpretation of results, manuscript preparation, critical revision, and final approval of the work.</w:t>
+      </w:r>
+    </w:p>
+    <w:p>
+      <w:pPr>
+        <w:pStyle w:val="Heading1"/>
+      </w:pPr>
+      <w:r>
+        <w:t>Funding</w:t>
+      </w:r>
+    </w:p>
+    <w:p>
+      <w:r>
+        <w:rPr>
+          <w:rFonts w:ascii="Times New Roman" w:hAnsi="Times New Roman"/>
+        </w:rPr>
+        <w:t>This research received no external funding.</w:t>
+      </w:r>
+    </w:p>
+    <w:p>
+      <w:pPr>
+        <w:pStyle w:val="Heading1"/>
+      </w:pPr>
+      <w:r>
+        <w:t>Conflict of interest</w:t>
+      </w:r>
+    </w:p>
+    <w:p>
+      <w:r>
+        <w:rPr>
+          <w:rFonts w:ascii="Times New Roman" w:hAnsi="Times New Roman"/>
+        </w:rPr>
+        <w:t>The authors declare no conflict of interest.</w:t>
+      </w:r>
+    </w:p>
+    <w:p>
+      <w:pPr>
+        <w:pStyle w:val="Heading1"/>
+      </w:pPr>
+      <w:r>
+        <w:t>Declaration of generative AI and AI-assisted technologies in the writing process</w:t>
+      </w:r>
+    </w:p>
+    <w:p>
+      <w:r>
+        <w:rPr>
+          <w:rFonts w:ascii="Times New Roman" w:hAnsi="Times New Roman"/>
+        </w:rPr>
+        <w:t>During the preparation of this manuscript, the authors used generative AI tools to support the literature-review process and language editing. All AI-assisted material was critically reviewed, verified, and edited by the authors, who take full responsibility for the accuracy, integrity, citations, and final content of the manuscript.</w:t>
+      </w:r>
+    </w:p>
+    <w:p>
+      <w:pPr>
+        <w:pStyle w:val="Heading1"/>
+      </w:pPr>
+      <w:r>
         <w:t>Resource availability</w:t>
       </w:r>
     </w:p>

</xml_diff>